<commit_message>
text welcome auf home
</commit_message>
<xml_diff>
--- a/angebote/aktuelle-angebote.docx
+++ b/angebote/aktuelle-angebote.docx
@@ -821,16 +821,7 @@
                                 <w:sz w:val="15"/>
                                 <w:szCs w:val="15"/>
                               </w:rPr>
-                              <w:t xml:space="preserve">Beschreibung </w:t>
-                            </w:r>
-                            <w:r>
-                              <w:rPr>
-                                <w:rFonts w:ascii="Verdana" w:hAnsi="Verdana"/>
-                                <w:color w:val="000000" w:themeColor="text1"/>
-                                <w:sz w:val="15"/>
-                                <w:szCs w:val="15"/>
-                              </w:rPr>
-                              <w:t>4</w:t>
+                              <w:t>Beschreibung 4</w:t>
                             </w:r>
                           </w:p>
                           <w:p>
@@ -855,16 +846,7 @@
                                 <w:sz w:val="15"/>
                                 <w:szCs w:val="15"/>
                               </w:rPr>
-                              <w:t xml:space="preserve">Beschreibung </w:t>
-                            </w:r>
-                            <w:r>
-                              <w:rPr>
-                                <w:rFonts w:ascii="Verdana" w:hAnsi="Verdana"/>
-                                <w:color w:val="000000" w:themeColor="text1"/>
-                                <w:sz w:val="15"/>
-                                <w:szCs w:val="15"/>
-                              </w:rPr>
-                              <w:t>5</w:t>
+                              <w:t>Beschreibung 5</w:t>
                             </w:r>
                           </w:p>
                         </w:txbxContent>
@@ -1283,29 +1265,7 @@
                                 <w:sz w:val="36"/>
                                 <w:szCs w:val="36"/>
                               </w:rPr>
-                              <w:t>1.</w:t>
-                            </w:r>
-                            <w:r>
-                              <w:rPr>
-                                <w:rFonts w:ascii="Verdana" w:hAnsi="Verdana"/>
-                                <w:b/>
-                                <w:bCs/>
-                                <w:color w:val="000000" w:themeColor="text1"/>
-                                <w:sz w:val="36"/>
-                                <w:szCs w:val="36"/>
-                              </w:rPr>
-                              <w:t>5</w:t>
-                            </w:r>
-                            <w:r>
-                              <w:rPr>
-                                <w:rFonts w:ascii="Verdana" w:hAnsi="Verdana"/>
-                                <w:b/>
-                                <w:bCs/>
-                                <w:color w:val="000000" w:themeColor="text1"/>
-                                <w:sz w:val="36"/>
-                                <w:szCs w:val="36"/>
-                              </w:rPr>
-                              <w:t>99,00€</w:t>
+                              <w:t>1.599,00€</w:t>
                             </w:r>
                           </w:p>
                         </w:txbxContent>

</xml_diff>